<commit_message>
chore: sync 2026-09-24 08:54:44 UTC
</commit_message>
<xml_diff>
--- a/deploy/prd/resumes/IT_Networking_resume.docx
+++ b/deploy/prd/resumes/IT_Networking_resume.docx
@@ -24,7 +24,7 @@
           <w:sz w:val="28"/>
           <w:szCs w:val="28"/>
         </w:rPr>
-        <w:t>David Park Omer</w:t>
+        <w:t>David Omer</w:t>
       </w:r>
     </w:p>
     <w:p>
@@ -59,7 +59,7 @@
             <w:sz w:val="20"/>
             <w:szCs w:val="20"/>
           </w:rPr>
-          <w:t>david_1428@outlook.com</w:t>
+          <w:t>david_omer@hotmail.com</w:t>
         </w:r>
       </w:hyperlink>
       <w:r>
@@ -70,7 +70,17 @@
           <w:sz w:val="20"/>
           <w:szCs w:val="20"/>
         </w:rPr>
-        <w:t xml:space="preserve"> • +1 562-833-4552</w:t>
+        <w:t xml:space="preserve"> • +1 562-</w:t>
+      </w:r>
+      <w:r>
+        <w:rPr>
+          <w:rFonts w:ascii="Aptos Display" w:hAnsi="Aptos Display"/>
+          <w:bCs/>
+          <w:w w:val="105"/>
+          <w:sz w:val="20"/>
+          <w:szCs w:val="20"/>
+        </w:rPr>
+        <w:t>377-6699</w:t>
       </w:r>
     </w:p>
     <w:p>
@@ -131,29 +141,7 @@
           <w:sz w:val="24"/>
           <w:szCs w:val="24"/>
         </w:rPr>
-        <w:t xml:space="preserve">IT and systems </w:t>
-      </w:r>
-      <w:proofErr w:type="gramStart"/>
-      <w:r>
-        <w:rPr>
-          <w:rFonts w:ascii="Aptos Display" w:hAnsi="Aptos Display" w:cs="Times New Roman"/>
-          <w:bCs/>
-          <w:w w:val="105"/>
-          <w:sz w:val="24"/>
-          <w:szCs w:val="24"/>
-        </w:rPr>
-        <w:t>professional</w:t>
-      </w:r>
-      <w:proofErr w:type="gramEnd"/>
-      <w:r>
-        <w:rPr>
-          <w:rFonts w:ascii="Aptos Display" w:hAnsi="Aptos Display" w:cs="Times New Roman"/>
-          <w:bCs/>
-          <w:w w:val="105"/>
-          <w:sz w:val="24"/>
-          <w:szCs w:val="24"/>
-        </w:rPr>
-        <w:t xml:space="preserve"> with </w:t>
+        <w:t xml:space="preserve">IT and systems professional with </w:t>
       </w:r>
       <w:r>
         <w:rPr>
@@ -621,7 +609,7 @@
             <w:sz w:val="24"/>
             <w:szCs w:val="24"/>
           </w:rPr>
-          <w:t>reviewnudge.dourl.net</w:t>
+          <w:t>reviewnudge.solutionsetal.com</w:t>
         </w:r>
       </w:hyperlink>
       <w:r>
@@ -663,25 +651,7 @@
             <w:sz w:val="24"/>
             <w:szCs w:val="24"/>
           </w:rPr>
-          <w:t>www.etal.sol</w:t>
-        </w:r>
-        <w:r>
-          <w:rPr>
-            <w:rStyle w:val="Hyperlink"/>
-            <w:rFonts w:ascii="Aptos Display" w:eastAsia="Times New Roman" w:hAnsi="Aptos Display" w:cs="Times New Roman"/>
-            <w:sz w:val="24"/>
-            <w:szCs w:val="24"/>
-          </w:rPr>
-          <w:t>u</w:t>
-        </w:r>
-        <w:r>
-          <w:rPr>
-            <w:rStyle w:val="Hyperlink"/>
-            <w:rFonts w:ascii="Aptos Display" w:eastAsia="Times New Roman" w:hAnsi="Aptos Display" w:cs="Times New Roman"/>
-            <w:sz w:val="24"/>
-            <w:szCs w:val="24"/>
-          </w:rPr>
-          <w:t>tions</w:t>
+          <w:t>www.solutionsetal.com</w:t>
         </w:r>
       </w:hyperlink>
       <w:r>
@@ -791,7 +761,23 @@
           <w:szCs w:val="24"/>
         </w:rPr>
         <w:lastRenderedPageBreak/>
-        <w:t>(https://etal.solutions), demonstrating modern web architecture, API integration, automated deployment, and technical content delivery.</w:t>
+        <w:t>(https://solutions</w:t>
+      </w:r>
+      <w:r>
+        <w:rPr>
+          <w:rFonts w:ascii="Aptos Display" w:eastAsia="Times New Roman" w:hAnsi="Aptos Display" w:cs="Times New Roman"/>
+          <w:sz w:val="24"/>
+          <w:szCs w:val="24"/>
+        </w:rPr>
+        <w:t>etal.com</w:t>
+      </w:r>
+      <w:r>
+        <w:rPr>
+          <w:rFonts w:ascii="Aptos Display" w:eastAsia="Times New Roman" w:hAnsi="Aptos Display" w:cs="Times New Roman"/>
+          <w:sz w:val="24"/>
+          <w:szCs w:val="24"/>
+        </w:rPr>
+        <w:t>), demonstrating modern web architecture, API integration, automated deployment, and technical content delivery.</w:t>
       </w:r>
     </w:p>
     <w:p>
@@ -1408,29 +1394,7 @@
           <w:sz w:val="24"/>
           <w:szCs w:val="24"/>
         </w:rPr>
-        <w:t xml:space="preserve"> </w:t>
-      </w:r>
-      <w:proofErr w:type="spellStart"/>
-      <w:r>
-        <w:rPr>
-          <w:rFonts w:ascii="Aptos Display" w:hAnsi="Aptos Display" w:cs="Times New Roman"/>
-          <w:bCs/>
-          <w:w w:val="105"/>
-          <w:sz w:val="24"/>
-          <w:szCs w:val="24"/>
-        </w:rPr>
-        <w:t>Portainer</w:t>
-      </w:r>
-      <w:proofErr w:type="spellEnd"/>
-      <w:r>
-        <w:rPr>
-          <w:rFonts w:ascii="Aptos Display" w:hAnsi="Aptos Display" w:cs="Times New Roman"/>
-          <w:bCs/>
-          <w:w w:val="105"/>
-          <w:sz w:val="24"/>
-          <w:szCs w:val="24"/>
-        </w:rPr>
-        <w:t>,</w:t>
+        <w:t xml:space="preserve"> Portainer,</w:t>
       </w:r>
       <w:r>
         <w:rPr>
@@ -1502,15 +1466,6 @@
           <w:szCs w:val="24"/>
         </w:rPr>
       </w:pPr>
-      <w:r>
-        <w:rPr>
-          <w:rFonts w:ascii="Aptos Display" w:eastAsia="Times New Roman" w:hAnsi="Aptos Display" w:cs="Times New Roman"/>
-          <w:sz w:val="24"/>
-          <w:szCs w:val="24"/>
-          <w:u w:val="single"/>
-        </w:rPr>
-        <w:tab/>
-      </w:r>
     </w:p>
     <w:sectPr>
       <w:footerReference w:type="default" r:id="rId11"/>

</xml_diff>